<commit_message>
Update user manual (Manuele Utente.docx)
Replace/update the binary user manual at doc/Manuele Utente.docx. The change is a modified .docx file (binary), so textual diffs are not shown. No source code or configuration changes.
</commit_message>
<xml_diff>
--- a/doc/Manuele Utente.docx
+++ b/doc/Manuele Utente.docx
@@ -12,12 +12,10 @@
         <w:pStyle w:val="Titolo"/>
       </w:pPr>
       <w:bookmarkStart w:id="0" w:name="_Toc232014360"/>
-      <w:proofErr w:type="spellStart"/>
       <w:r>
         <w:t>BariGo</w:t>
       </w:r>
       <w:bookmarkEnd w:id="0"/>
-      <w:proofErr w:type="spellEnd"/>
     </w:p>
     <w:p>
       <w:pPr>
@@ -397,6 +395,13 @@
     </w:p>
     <w:sdt>
       <w:sdtPr>
+        <w:rPr>
+          <w:rFonts w:ascii="Avenir Book" w:eastAsiaTheme="minorHAnsi" w:hAnsi="Avenir Book" w:cstheme="minorBidi"/>
+          <w:color w:val="auto"/>
+          <w:sz w:val="24"/>
+          <w:szCs w:val="24"/>
+          <w:lang w:eastAsia="en-US"/>
+        </w:rPr>
         <w:id w:val="-761687277"/>
         <w:docPartObj>
           <w:docPartGallery w:val="Table of Contents"/>
@@ -405,13 +410,8 @@
       </w:sdtPr>
       <w:sdtEndPr>
         <w:rPr>
-          <w:rFonts w:ascii="Avenir Book" w:eastAsiaTheme="minorHAnsi" w:hAnsi="Avenir Book" w:cstheme="minorBidi"/>
           <w:b/>
           <w:bCs/>
-          <w:color w:val="auto"/>
-          <w:sz w:val="24"/>
-          <w:szCs w:val="24"/>
-          <w:lang w:eastAsia="en-US"/>
         </w:rPr>
       </w:sdtEndPr>
       <w:sdtContent>
@@ -1545,13 +1545,8 @@
       <w:bookmarkEnd w:id="3"/>
     </w:p>
     <w:p>
-      <w:proofErr w:type="spellStart"/>
-      <w:r>
-        <w:t>BariGo</w:t>
-      </w:r>
-      <w:proofErr w:type="spellEnd"/>
-      <w:r>
-        <w:t xml:space="preserve"> è un videogioco educativo (Serious Game) in formato RPG 2D con visuale dall'alto, sviluppato con Godot Engine, che trasforma la città di Bari in un'avventura culturale interattiva. Invece di leggere una guida o seguire una lezione tradizionale, il giocatore esplora una ricostruzione stilizzata della città, incontra i suoi protagonisti e ne scopre i segreti attraverso missioni e minigiochi.</w:t>
+      <w:r>
+        <w:t>BariGo è un videogioco educativo (Serious Game) in formato RPG 2D con visuale dall'alto, sviluppato con Godot Engine, che trasforma la città di Bari in un'avventura culturale interattiva. Invece di leggere una guida o seguire una lezione tradizionale, il giocatore esplora una ricostruzione stilizzata della città, incontra i suoi protagonisti e ne scopre i segreti attraverso missioni e minigiochi.</w:t>
       </w:r>
     </w:p>
     <w:p>
@@ -1602,13 +1597,8 @@
       <w:bookmarkEnd w:id="4"/>
     </w:p>
     <w:p>
-      <w:proofErr w:type="spellStart"/>
-      <w:r>
-        <w:t>BariGo</w:t>
-      </w:r>
-      <w:proofErr w:type="spellEnd"/>
-      <w:r>
-        <w:t xml:space="preserve"> si propone di raggiungere i seguenti obiettivi formativi e ludici:</w:t>
+      <w:r>
+        <w:t>BariGo si propone di raggiungere i seguenti obiettivi formativi e ludici:</w:t>
       </w:r>
     </w:p>
     <w:p>
@@ -1713,13 +1703,8 @@
       <w:bookmarkEnd w:id="5"/>
     </w:p>
     <w:p>
-      <w:proofErr w:type="spellStart"/>
-      <w:r>
-        <w:t>BariGo</w:t>
-      </w:r>
-      <w:proofErr w:type="spellEnd"/>
-      <w:r>
-        <w:t xml:space="preserve"> è sviluppato con </w:t>
+      <w:r>
+        <w:t xml:space="preserve">BariGo è sviluppato con </w:t>
       </w:r>
       <w:r>
         <w:rPr>
@@ -1782,7 +1767,6 @@
                 <w:lang w:val="en-GB"/>
               </w:rPr>
             </w:pPr>
-            <w:proofErr w:type="spellStart"/>
             <w:r>
               <w:rPr>
                 <w:b/>
@@ -1791,7 +1775,6 @@
               </w:rPr>
               <w:t>Componente</w:t>
             </w:r>
-            <w:proofErr w:type="spellEnd"/>
           </w:p>
         </w:tc>
         <w:tc>
@@ -1808,34 +1791,14 @@
                 <w:lang w:val="en-GB"/>
               </w:rPr>
             </w:pPr>
-            <w:proofErr w:type="spellStart"/>
             <w:r>
               <w:rPr>
                 <w:b/>
                 <w:bCs/>
                 <w:lang w:val="en-GB"/>
               </w:rPr>
-              <w:t>Requisiti</w:t>
-            </w:r>
-            <w:proofErr w:type="spellEnd"/>
-            <w:r>
-              <w:rPr>
-                <w:b/>
-                <w:bCs/>
-                <w:lang w:val="en-GB"/>
-              </w:rPr>
-              <w:t xml:space="preserve"> </w:t>
-            </w:r>
-            <w:proofErr w:type="spellStart"/>
-            <w:r>
-              <w:rPr>
-                <w:b/>
-                <w:bCs/>
-                <w:lang w:val="en-GB"/>
-              </w:rPr>
-              <w:t>Minimi</w:t>
-            </w:r>
-            <w:proofErr w:type="spellEnd"/>
+              <w:t>Requisiti Minimi</w:t>
+            </w:r>
           </w:p>
         </w:tc>
         <w:tc>
@@ -1852,34 +1815,14 @@
                 <w:lang w:val="en-GB"/>
               </w:rPr>
             </w:pPr>
-            <w:proofErr w:type="spellStart"/>
             <w:r>
               <w:rPr>
                 <w:b/>
                 <w:bCs/>
                 <w:lang w:val="en-GB"/>
               </w:rPr>
-              <w:t>Requisiti</w:t>
-            </w:r>
-            <w:proofErr w:type="spellEnd"/>
-            <w:r>
-              <w:rPr>
-                <w:b/>
-                <w:bCs/>
-                <w:lang w:val="en-GB"/>
-              </w:rPr>
-              <w:t xml:space="preserve"> </w:t>
-            </w:r>
-            <w:proofErr w:type="spellStart"/>
-            <w:r>
-              <w:rPr>
-                <w:b/>
-                <w:bCs/>
-                <w:lang w:val="en-GB"/>
-              </w:rPr>
-              <w:t>Consigliati</w:t>
-            </w:r>
-            <w:proofErr w:type="spellEnd"/>
+              <w:t>Requisiti Consigliati</w:t>
+            </w:r>
           </w:p>
         </w:tc>
       </w:tr>
@@ -2017,41 +1960,13 @@
                 <w:lang w:val="en-GB"/>
               </w:rPr>
             </w:pPr>
-            <w:proofErr w:type="spellStart"/>
             <w:r>
               <w:rPr>
                 <w:b/>
                 <w:bCs/>
                 <w:lang w:val="en-GB"/>
               </w:rPr>
-              <w:t>Spazio</w:t>
-            </w:r>
-            <w:proofErr w:type="spellEnd"/>
-            <w:r>
-              <w:rPr>
-                <w:b/>
-                <w:bCs/>
-                <w:lang w:val="en-GB"/>
-              </w:rPr>
-              <w:t xml:space="preserve"> </w:t>
-            </w:r>
-            <w:proofErr w:type="spellStart"/>
-            <w:r>
-              <w:rPr>
-                <w:b/>
-                <w:bCs/>
-                <w:lang w:val="en-GB"/>
-              </w:rPr>
-              <w:t>su</w:t>
-            </w:r>
-            <w:proofErr w:type="spellEnd"/>
-            <w:r>
-              <w:rPr>
-                <w:b/>
-                <w:bCs/>
-                <w:lang w:val="en-GB"/>
-              </w:rPr>
-              <w:t xml:space="preserve"> disco</w:t>
+              <w:t>Spazio su disco</w:t>
             </w:r>
           </w:p>
         </w:tc>
@@ -2071,16 +1986,8 @@
               <w:rPr>
                 <w:lang w:val="en-GB"/>
               </w:rPr>
-              <w:t xml:space="preserve">300 MB </w:t>
-            </w:r>
-            <w:proofErr w:type="spellStart"/>
-            <w:r>
-              <w:rPr>
-                <w:lang w:val="en-GB"/>
-              </w:rPr>
-              <w:t>liberi</w:t>
-            </w:r>
-            <w:proofErr w:type="spellEnd"/>
+              <w:t>300 MB liberi</w:t>
+            </w:r>
           </w:p>
         </w:tc>
         <w:tc>
@@ -2099,16 +2006,8 @@
               <w:rPr>
                 <w:lang w:val="en-GB"/>
               </w:rPr>
-              <w:t xml:space="preserve">500 MB </w:t>
-            </w:r>
-            <w:proofErr w:type="spellStart"/>
-            <w:r>
-              <w:rPr>
-                <w:lang w:val="en-GB"/>
-              </w:rPr>
-              <w:t>liberi</w:t>
-            </w:r>
-            <w:proofErr w:type="spellEnd"/>
+              <w:t>500 MB liberi</w:t>
+            </w:r>
           </w:p>
         </w:tc>
       </w:tr>
@@ -2178,59 +2077,13 @@
           <w:lang w:val="en-GB"/>
         </w:rPr>
       </w:pPr>
-      <w:proofErr w:type="spellStart"/>
       <w:r>
         <w:rPr>
           <w:b/>
           <w:bCs/>
           <w:lang w:val="en-GB"/>
         </w:rPr>
-        <w:t>Sistemi</w:t>
-      </w:r>
-      <w:proofErr w:type="spellEnd"/>
-      <w:r>
-        <w:rPr>
-          <w:b/>
-          <w:bCs/>
-          <w:lang w:val="en-GB"/>
-        </w:rPr>
-        <w:t xml:space="preserve"> </w:t>
-      </w:r>
-      <w:proofErr w:type="spellStart"/>
-      <w:r>
-        <w:rPr>
-          <w:b/>
-          <w:bCs/>
-          <w:lang w:val="en-GB"/>
-        </w:rPr>
-        <w:t>operativi</w:t>
-      </w:r>
-      <w:proofErr w:type="spellEnd"/>
-      <w:r>
-        <w:rPr>
-          <w:b/>
-          <w:bCs/>
-          <w:lang w:val="en-GB"/>
-        </w:rPr>
-        <w:t xml:space="preserve"> </w:t>
-      </w:r>
-      <w:proofErr w:type="spellStart"/>
-      <w:r>
-        <w:rPr>
-          <w:b/>
-          <w:bCs/>
-          <w:lang w:val="en-GB"/>
-        </w:rPr>
-        <w:t>supportati</w:t>
-      </w:r>
-      <w:proofErr w:type="spellEnd"/>
-      <w:r>
-        <w:rPr>
-          <w:b/>
-          <w:bCs/>
-          <w:lang w:val="en-GB"/>
-        </w:rPr>
-        <w:t>:</w:t>
+        <w:t>Sistemi operativi supportati:</w:t>
       </w:r>
     </w:p>
     <w:p>
@@ -2264,21 +2117,7 @@
         <w:rPr>
           <w:lang w:val="en-GB"/>
         </w:rPr>
-        <w:t xml:space="preserve">macOS 10.15 (Catalina) o </w:t>
-      </w:r>
-      <w:proofErr w:type="spellStart"/>
-      <w:r>
-        <w:rPr>
-          <w:lang w:val="en-GB"/>
-        </w:rPr>
-        <w:t>versioni</w:t>
-      </w:r>
-      <w:proofErr w:type="spellEnd"/>
-      <w:r>
-        <w:rPr>
-          <w:lang w:val="en-GB"/>
-        </w:rPr>
-        <w:t xml:space="preserve"> successive</w:t>
+        <w:t>macOS 10.15 (Catalina) o versioni successive</w:t>
       </w:r>
     </w:p>
     <w:p>
@@ -2290,6 +2129,26 @@
       </w:pPr>
       <w:r>
         <w:t>Linux (distribuzioni principali con supporto X11)</w:t>
+      </w:r>
+    </w:p>
+    <w:p>
+      <w:pPr>
+        <w:numPr>
+          <w:ilvl w:val="0"/>
+          <w:numId w:val="15"/>
+        </w:numPr>
+      </w:pPr>
+      <w:r>
+        <w:t xml:space="preserve">Browser (Chrome, Firefox, Edge aggiornati) </w:t>
+      </w:r>
+      <w:r>
+        <w:t>–</w:t>
+      </w:r>
+      <w:r>
+        <w:t xml:space="preserve"> ne</w:t>
+      </w:r>
+      <w:r>
+        <w:t>ssuna installazione richiesta</w:t>
       </w:r>
     </w:p>
     <w:p>
@@ -2516,16 +2375,11 @@
     </w:p>
     <w:p>
       <w:r>
-        <w:t>Una volta estratto il pacchetto, fare doppio clic sull'icona "</w:t>
-      </w:r>
-      <w:proofErr w:type="spellStart"/>
-      <w:r>
-        <w:t>BariG</w:t>
+        <w:t>Una volta estratto il pacchetto, fare doppio clic sull'icona "BariG</w:t>
       </w:r>
       <w:r>
         <w:t>o</w:t>
       </w:r>
-      <w:proofErr w:type="spellEnd"/>
       <w:r>
         <w:t>" all'interno della cartella</w:t>
       </w:r>
@@ -2660,15 +2514,7 @@
         <w:t>Inizia:</w:t>
       </w:r>
       <w:r>
-        <w:t xml:space="preserve"> Avvia la partita, portando l'utente al </w:t>
-      </w:r>
-      <w:proofErr w:type="spellStart"/>
-      <w:r>
-        <w:t>menù</w:t>
-      </w:r>
-      <w:proofErr w:type="spellEnd"/>
-      <w:r>
-        <w:t xml:space="preserve"> di selezione o all'inizio dell'avventura.</w:t>
+        <w:t xml:space="preserve"> Avvia la partita, portando l'utente al menù di selezione o all'inizio dell'avventura.</w:t>
       </w:r>
     </w:p>
     <w:p>
@@ -2947,15 +2793,7 @@
         <w:t xml:space="preserve">Una volta </w:t>
       </w:r>
       <w:r>
-        <w:t>premuto il bottone “</w:t>
-      </w:r>
-      <w:proofErr w:type="gramStart"/>
-      <w:r>
-        <w:t>inizia”(</w:t>
-      </w:r>
-      <w:proofErr w:type="gramEnd"/>
-      <w:r>
-        <w:t xml:space="preserve">immagine </w:t>
+        <w:t xml:space="preserve">premuto il bottone “inizia”(immagine </w:t>
       </w:r>
       <w:r>
         <w:t>3</w:t>
@@ -3009,14 +2847,7 @@
           <w:b/>
           <w:bCs/>
         </w:rPr>
-        <w:t xml:space="preserve"> </w:t>
-      </w:r>
-      <w:r>
-        <w:rPr>
-          <w:b/>
-          <w:bCs/>
-        </w:rPr>
-        <w:t>Avatar:</w:t>
+        <w:t xml:space="preserve"> Avatar:</w:t>
       </w:r>
       <w:r>
         <w:t xml:space="preserve"> Rappresenta il personaggio guidato dal giocatore.</w:t>
@@ -3171,21 +3002,7 @@
         <w:rPr>
           <w:rStyle w:val="Titolo2Carattere"/>
         </w:rPr>
-        <w:t xml:space="preserve">Dialogo </w:t>
-      </w:r>
-      <w:proofErr w:type="spellStart"/>
-      <w:r>
-        <w:rPr>
-          <w:rStyle w:val="Titolo2Carattere"/>
-        </w:rPr>
-        <w:t>pre</w:t>
-      </w:r>
-      <w:proofErr w:type="spellEnd"/>
-      <w:r>
-        <w:rPr>
-          <w:rStyle w:val="Titolo2Carattere"/>
-        </w:rPr>
-        <w:t>-minigioco</w:t>
+        <w:t>Dialogo pre-minigioco</w:t>
       </w:r>
       <w:bookmarkEnd w:id="13"/>
       <w:r>
@@ -3279,53 +3096,38 @@
           <w:b/>
           <w:bCs/>
         </w:rPr>
-        <w:t>NPC Narratore</w:t>
+        <w:t>NPC Narratore:</w:t>
+      </w:r>
+      <w:r>
+        <w:t xml:space="preserve"> </w:t>
+      </w:r>
+      <w:r>
+        <w:t xml:space="preserve">Personaggio </w:t>
+      </w:r>
+      <w:r>
+        <w:t>non giocabile, racconta la storia del teatro e ti permette di avviare il minigioco inerente;</w:t>
+      </w:r>
+    </w:p>
+    <w:p>
+      <w:r>
+        <w:t xml:space="preserve">2. </w:t>
       </w:r>
       <w:r>
         <w:rPr>
           <w:b/>
           <w:bCs/>
         </w:rPr>
-        <w:t>:</w:t>
-      </w:r>
-      <w:r>
-        <w:t xml:space="preserve"> </w:t>
-      </w:r>
-      <w:r>
-        <w:t xml:space="preserve">Personaggio </w:t>
-      </w:r>
-      <w:r>
-        <w:t>non giocabile, racconta la storia del teatro e ti permette di avviare il minigioco inerente;</w:t>
-      </w:r>
-    </w:p>
-    <w:p>
-      <w:r>
-        <w:t xml:space="preserve">2. </w:t>
+        <w:t xml:space="preserve">Blocco </w:t>
       </w:r>
       <w:r>
         <w:rPr>
           <w:b/>
           <w:bCs/>
         </w:rPr>
-        <w:t xml:space="preserve">Blocco </w:t>
-      </w:r>
-      <w:r>
-        <w:rPr>
-          <w:b/>
-          <w:bCs/>
-        </w:rPr>
         <w:t xml:space="preserve">Dialogo: </w:t>
       </w:r>
       <w:r>
-        <w:t xml:space="preserve">trascrizione testuale del dialogo con </w:t>
-      </w:r>
-      <w:proofErr w:type="spellStart"/>
-      <w:r>
-        <w:t>portrait</w:t>
-      </w:r>
-      <w:proofErr w:type="spellEnd"/>
-      <w:r>
-        <w:t xml:space="preserve"> dell’NPC;</w:t>
+        <w:t>trascrizione testuale del dialogo con portrait dell’NPC;</w:t>
       </w:r>
     </w:p>
     <w:p>
@@ -3434,14 +3236,7 @@
           <w:b/>
           <w:bCs/>
         </w:rPr>
-        <w:t>Ambientazione</w:t>
-      </w:r>
-      <w:r>
-        <w:rPr>
-          <w:b/>
-          <w:bCs/>
-        </w:rPr>
-        <w:t>:</w:t>
+        <w:t>Ambientazione:</w:t>
       </w:r>
       <w:r>
         <w:t xml:space="preserve"> </w:t>
@@ -3470,39 +3265,25 @@
           <w:b/>
           <w:bCs/>
         </w:rPr>
-        <w:t>Testo completament</w:t>
+        <w:t>Testo completamento:</w:t>
+      </w:r>
+      <w:r>
+        <w:t xml:space="preserve"> </w:t>
+      </w:r>
+      <w:r>
+        <w:t>Messaggio informativo che conferma il raggiungimento dell'obiettivo</w:t>
+      </w:r>
+    </w:p>
+    <w:p>
+      <w:r>
+        <w:t xml:space="preserve">3. </w:t>
       </w:r>
       <w:r>
         <w:rPr>
           <w:b/>
           <w:bCs/>
         </w:rPr>
-        <w:t>o:</w:t>
-      </w:r>
-      <w:r>
-        <w:t xml:space="preserve"> </w:t>
-      </w:r>
-      <w:r>
-        <w:t>Messaggio informativo che conferma il raggiungimento dell'obiettivo</w:t>
-      </w:r>
-    </w:p>
-    <w:p>
-      <w:r>
-        <w:t xml:space="preserve">3. </w:t>
-      </w:r>
-      <w:r>
-        <w:rPr>
-          <w:b/>
-          <w:bCs/>
-        </w:rPr>
-        <w:t>Bandierina</w:t>
-      </w:r>
-      <w:r>
-        <w:rPr>
-          <w:b/>
-          <w:bCs/>
-        </w:rPr>
-        <w:t>:</w:t>
+        <w:t>Bandierina:</w:t>
       </w:r>
       <w:r>
         <w:t xml:space="preserve"> </w:t>
@@ -3700,11 +3481,9 @@
     <w:r>
       <w:fldChar w:fldCharType="end"/>
     </w:r>
-    <w:proofErr w:type="spellStart"/>
     <w:r>
       <w:t>BariGO</w:t>
     </w:r>
-    <w:proofErr w:type="spellEnd"/>
     <w:r>
       <w:t xml:space="preserve"> – PPM </w:t>
     </w:r>
@@ -3802,14 +3581,12 @@
                               <w:rFonts w:ascii="Garamond" w:hAnsi="Garamond"/>
                             </w:rPr>
                           </w:pPr>
-                          <w:proofErr w:type="spellStart"/>
                           <w:r>
                             <w:rPr>
                               <w:rFonts w:ascii="Garamond" w:hAnsi="Garamond"/>
                             </w:rPr>
                             <w:t>CdS</w:t>
                           </w:r>
-                          <w:proofErr w:type="spellEnd"/>
                           <w:r>
                             <w:rPr>
                               <w:rFonts w:ascii="Garamond" w:hAnsi="Garamond"/>
@@ -3891,14 +3668,12 @@
                         <w:rFonts w:ascii="Garamond" w:hAnsi="Garamond"/>
                       </w:rPr>
                     </w:pPr>
-                    <w:proofErr w:type="spellStart"/>
                     <w:r>
                       <w:rPr>
                         <w:rFonts w:ascii="Garamond" w:hAnsi="Garamond"/>
                       </w:rPr>
                       <w:t>CdS</w:t>
                     </w:r>
-                    <w:proofErr w:type="spellEnd"/>
                     <w:r>
                       <w:rPr>
                         <w:rFonts w:ascii="Garamond" w:hAnsi="Garamond"/>
@@ -6617,6 +6392,7 @@
   <w:style w:type="character" w:default="1" w:styleId="Carpredefinitoparagrafo">
     <w:name w:val="Default Paragraph Font"/>
     <w:uiPriority w:val="1"/>
+    <w:semiHidden/>
     <w:unhideWhenUsed/>
   </w:style>
   <w:style w:type="table" w:default="1" w:styleId="Tabellanormale">

</xml_diff>